<commit_message>
Treat division symbol as a stacked fraction; convert 3xy ÷ r in packet
Apply the new convention: a division symbol always becomes a stacked
fraction. Convert the remaining inline division in the Unit 1 packet
(3xy ÷ r + 8 -> fraction 3xy over r, + 8), bringing the packet to 12
native equations with content fully preserved. Record the rule in
CONVENTIONS.md and update convert_math.py.

Co-Authored-By: Claude Opus 4.8 <noreply@anthropic.com>
Claude-Session: https://claude.ai/code/session_01FC3BfbH3eZoJiVptb2oNST
</commit_message>
<xml_diff>
--- a/algebra1-notes/Alg_1_Unit_1_Notes_Packet_native_equations.docx
+++ b/algebra1-notes/Alg_1_Unit_1_Notes_Packet_native_equations.docx
@@ -1293,7 +1293,39 @@
               <w:rPr>
                 <w:rtl w:val="0"/>
               </w:rPr>
-              <w:t xml:space="preserve">10. Evaluate 3xy ÷ r + 8; use x = 3, y = 4, and r = 6</w:t>
+              <w:t xml:space="preserve">10. Evaluate </w:t>
+            </w:r>
+            <m:oMath>
+              <m:f>
+                <m:fPr>
+                  <m:ctrlPr>
+                    <w:rPr/>
+                  </m:ctrlPr>
+                </m:fPr>
+                <m:num>
+                  <m:r>
+                    <w:rPr/>
+                    <m:t xml:space="preserve">3xy</m:t>
+                  </m:r>
+                </m:num>
+                <m:den>
+                  <m:r>
+                    <w:rPr/>
+                    <m:t xml:space="preserve">r</m:t>
+                  </m:r>
+                </m:den>
+              </m:f>
+            </m:oMath>
+            <w:r>
+              <w:rPr>
+                <w:rtl w:val="0"/>
+              </w:rPr>
+              <w:t xml:space="preserve"> + 8; use x = 3, y = 4, and r = 6</w:t>
+            </w:r>
+            <w:r>
+              <w:rPr>
+                <w:rtl w:val="0"/>
+              </w:rPr>
               <w:br w:type="textWrapping"/>
               <w:br w:type="textWrapping"/>
               <w:br w:type="textWrapping"/>

</xml_diff>